<commit_message>
update(laporan): update cover and remove daftar tilik
</commit_message>
<xml_diff>
--- a/storage/app/public/template/template_laporan_merge.docx
+++ b/storage/app/public/template/template_laporan_merge.docx
@@ -24,7 +24,7 @@
           <w:szCs w:val="96"/>
         </w:rPr>
         <w:drawing>
-          <wp:anchor distT="0" distB="0" distL="114300" distR="114300" simplePos="0" relativeHeight="251658240" behindDoc="1" locked="0" layoutInCell="1" allowOverlap="1" wp14:anchorId="3B0A74D9" wp14:editId="12221787">
+          <wp:anchor distT="0" distB="0" distL="114300" distR="114300" simplePos="0" relativeHeight="251658240" behindDoc="1" locked="0" layoutInCell="1" allowOverlap="1" wp14:anchorId="3B0A74D9" wp14:editId="62ABF278">
             <wp:simplePos x="0" y="0"/>
             <wp:positionH relativeFrom="page">
               <wp:align>left</wp:align>
@@ -32,7 +32,7 @@
             <wp:positionV relativeFrom="paragraph">
               <wp:posOffset>-717550</wp:posOffset>
             </wp:positionV>
-            <wp:extent cx="7574361" cy="10713701"/>
+            <wp:extent cx="7574361" cy="10713382"/>
             <wp:effectExtent l="0" t="0" r="7620" b="0"/>
             <wp:wrapNone/>
             <wp:docPr id="1958599514" name="Picture 1"/>
@@ -43,7 +43,7 @@
               <a:graphicData uri="http://schemas.openxmlformats.org/drawingml/2006/picture">
                 <pic:pic xmlns:pic="http://schemas.openxmlformats.org/drawingml/2006/picture">
                   <pic:nvPicPr>
-                    <pic:cNvPr id="1958599514" name="Picture 1958599514"/>
+                    <pic:cNvPr id="1958599514" name="Picture 1"/>
                     <pic:cNvPicPr/>
                   </pic:nvPicPr>
                   <pic:blipFill>
@@ -61,7 +61,7 @@
                   <pic:spPr>
                     <a:xfrm>
                       <a:off x="0" y="0"/>
-                      <a:ext cx="7574361" cy="10713701"/>
+                      <a:ext cx="7574361" cy="10713382"/>
                     </a:xfrm>
                     <a:prstGeom prst="rect">
                       <a:avLst/>
@@ -253,6 +253,7 @@
                                 <w:sz w:val="30"/>
                               </w:rPr>
                             </w:pPr>
+                            <w:proofErr w:type="spellStart"/>
                             <w:r>
                               <w:rPr>
                                 <w:rFonts w:ascii="Trebuchet MS" w:hAnsi="Trebuchet MS"/>
@@ -263,6 +264,7 @@
                               </w:rPr>
                               <w:t>Tahun</w:t>
                             </w:r>
+                            <w:proofErr w:type="spellEnd"/>
                             <w:r>
                               <w:rPr>
                                 <w:rFonts w:ascii="Trebuchet MS" w:hAnsi="Trebuchet MS"/>
@@ -283,7 +285,31 @@
                                 <w:w w:val="105"/>
                                 <w:sz w:val="30"/>
                               </w:rPr>
-                              <w:t>${tahun}</w:t>
+                              <w:t>${</w:t>
+                            </w:r>
+                            <w:proofErr w:type="spellStart"/>
+                            <w:r>
+                              <w:rPr>
+                                <w:rFonts w:ascii="Trebuchet MS" w:hAnsi="Trebuchet MS"/>
+                                <w:b/>
+                                <w:color w:val="FFFFFF"/>
+                                <w:spacing w:val="-4"/>
+                                <w:w w:val="105"/>
+                                <w:sz w:val="30"/>
+                              </w:rPr>
+                              <w:t>tahun</w:t>
+                            </w:r>
+                            <w:proofErr w:type="spellEnd"/>
+                            <w:r>
+                              <w:rPr>
+                                <w:rFonts w:ascii="Trebuchet MS" w:hAnsi="Trebuchet MS"/>
+                                <w:b/>
+                                <w:color w:val="FFFFFF"/>
+                                <w:spacing w:val="-4"/>
+                                <w:w w:val="105"/>
+                                <w:sz w:val="30"/>
+                              </w:rPr>
+                              <w:t>}</w:t>
                             </w:r>
                           </w:p>
                         </w:txbxContent>
@@ -320,6 +346,7 @@
                           <w:sz w:val="30"/>
                         </w:rPr>
                       </w:pPr>
+                      <w:proofErr w:type="spellStart"/>
                       <w:r>
                         <w:rPr>
                           <w:rFonts w:ascii="Trebuchet MS" w:hAnsi="Trebuchet MS"/>
@@ -330,6 +357,7 @@
                         </w:rPr>
                         <w:t>Tahun</w:t>
                       </w:r>
+                      <w:proofErr w:type="spellEnd"/>
                       <w:r>
                         <w:rPr>
                           <w:rFonts w:ascii="Trebuchet MS" w:hAnsi="Trebuchet MS"/>
@@ -350,7 +378,31 @@
                           <w:w w:val="105"/>
                           <w:sz w:val="30"/>
                         </w:rPr>
-                        <w:t>${tahun}</w:t>
+                        <w:t>${</w:t>
+                      </w:r>
+                      <w:proofErr w:type="spellStart"/>
+                      <w:r>
+                        <w:rPr>
+                          <w:rFonts w:ascii="Trebuchet MS" w:hAnsi="Trebuchet MS"/>
+                          <w:b/>
+                          <w:color w:val="FFFFFF"/>
+                          <w:spacing w:val="-4"/>
+                          <w:w w:val="105"/>
+                          <w:sz w:val="30"/>
+                        </w:rPr>
+                        <w:t>tahun</w:t>
+                      </w:r>
+                      <w:proofErr w:type="spellEnd"/>
+                      <w:r>
+                        <w:rPr>
+                          <w:rFonts w:ascii="Trebuchet MS" w:hAnsi="Trebuchet MS"/>
+                          <w:b/>
+                          <w:color w:val="FFFFFF"/>
+                          <w:spacing w:val="-4"/>
+                          <w:w w:val="105"/>
+                          <w:sz w:val="30"/>
+                        </w:rPr>
+                        <w:t>}</w:t>
                       </w:r>
                     </w:p>
                   </w:txbxContent>
@@ -1621,18 +1673,7 @@
     </w:tbl>
     <w:p>
       <w:pPr>
-        <w:jc w:val="center"/>
-        <w:rPr>
-          <w:rFonts w:ascii="Arial" w:hAnsi="Arial" w:cs="Arial"/>
-          <w:b/>
-          <w:noProof/>
-        </w:rPr>
-      </w:pPr>
-    </w:p>
-    <w:p>
-      <w:pPr>
         <w:spacing w:after="0" w:line="240" w:lineRule="auto"/>
-        <w:ind w:left="83"/>
         <w:rPr>
           <w:rFonts w:ascii="Trebuchet MS" w:hAnsi="Trebuchet MS" w:cs="Arial"/>
           <w:b/>
@@ -1646,1269 +1687,8 @@
           <w:rFonts w:ascii="Trebuchet MS" w:hAnsi="Trebuchet MS" w:cs="Arial"/>
           <w:b/>
           <w:bCs/>
-          <w:sz w:val="96"/>
-          <w:szCs w:val="96"/>
-        </w:rPr>
-      </w:pPr>
-      <w:r>
-        <w:rPr>
-          <w:rFonts w:ascii="Trebuchet MS" w:hAnsi="Trebuchet MS" w:cs="Arial"/>
-          <w:b/>
-          <w:bCs/>
-          <w:sz w:val="96"/>
-          <w:szCs w:val="96"/>
-        </w:rPr>
-        <w:br w:type="page"/>
-      </w:r>
-    </w:p>
-    <w:tbl>
-      <w:tblPr>
-        <w:tblW w:w="10095" w:type="dxa"/>
-        <w:tblInd w:w="-459" w:type="dxa"/>
-        <w:tblBorders>
-          <w:top w:val="single" w:sz="4" w:space="0" w:color="auto"/>
-          <w:left w:val="single" w:sz="4" w:space="0" w:color="auto"/>
-          <w:bottom w:val="single" w:sz="4" w:space="0" w:color="auto"/>
-          <w:right w:val="single" w:sz="4" w:space="0" w:color="auto"/>
-          <w:insideH w:val="single" w:sz="4" w:space="0" w:color="auto"/>
-          <w:insideV w:val="single" w:sz="4" w:space="0" w:color="auto"/>
-        </w:tblBorders>
-        <w:shd w:val="clear" w:color="auto" w:fill="FFFFFF"/>
-        <w:tblLayout w:type="fixed"/>
-        <w:tblLook w:val="01E0" w:firstRow="1" w:lastRow="1" w:firstColumn="1" w:lastColumn="1" w:noHBand="0" w:noVBand="0"/>
-      </w:tblPr>
-      <w:tblGrid>
-        <w:gridCol w:w="1373"/>
-        <w:gridCol w:w="5966"/>
-        <w:gridCol w:w="2756"/>
-      </w:tblGrid>
-      <w:tr>
-        <w:trPr>
-          <w:trHeight w:val="1290"/>
-        </w:trPr>
-        <w:tc>
-          <w:tcPr>
-            <w:tcW w:w="1373" w:type="dxa"/>
-            <w:tcBorders>
-              <w:top w:val="single" w:sz="4" w:space="0" w:color="auto"/>
-              <w:left w:val="single" w:sz="4" w:space="0" w:color="auto"/>
-              <w:bottom w:val="single" w:sz="4" w:space="0" w:color="auto"/>
-              <w:right w:val="single" w:sz="4" w:space="0" w:color="auto"/>
-            </w:tcBorders>
-            <w:shd w:val="clear" w:color="auto" w:fill="FFFFFF"/>
-            <w:vAlign w:val="center"/>
-            <w:hideMark/>
-          </w:tcPr>
-          <w:p>
-            <w:pPr>
-              <w:shd w:val="clear" w:color="auto" w:fill="FFFFFF"/>
-              <w:spacing w:after="0" w:line="240" w:lineRule="auto"/>
-              <w:jc w:val="center"/>
-              <w:rPr>
-                <w:rFonts w:ascii="Arial" w:eastAsia="Calibri" w:hAnsi="Arial" w:cs="Arial"/>
-                <w:color w:val="FF0000"/>
-                <w:kern w:val="0"/>
-                <w:sz w:val="20"/>
-                <w:szCs w:val="20"/>
-                <w:lang w:val="en-US"/>
-                <w14:ligatures w14:val="none"/>
-              </w:rPr>
-            </w:pPr>
-            <w:r>
-              <w:rPr>
-                <w:rFonts w:ascii="Arial" w:eastAsia="Calibri" w:hAnsi="Arial" w:cs="Arial"/>
-                <w:noProof/>
-                <w:kern w:val="0"/>
-                <w:sz w:val="20"/>
-                <w:szCs w:val="20"/>
-                <w:lang w:val="en-US"/>
-                <w14:ligatures w14:val="none"/>
-              </w:rPr>
-              <w:lastRenderedPageBreak/>
-              <w:drawing>
-                <wp:inline distT="0" distB="0" distL="0" distR="0" wp14:anchorId="7734D21C" wp14:editId="2E221C41">
-                  <wp:extent cx="803275" cy="819150"/>
-                  <wp:effectExtent l="0" t="0" r="0" b="0"/>
-                  <wp:docPr id="8" name="Picture 2" descr="Logo Universitas Jenderal Soedirman Purwokerto - Logo Gratis"/>
-                  <wp:cNvGraphicFramePr>
-                    <a:graphicFrameLocks xmlns:a="http://schemas.openxmlformats.org/drawingml/2006/main" noChangeAspect="1"/>
-                  </wp:cNvGraphicFramePr>
-                  <a:graphic xmlns:a="http://schemas.openxmlformats.org/drawingml/2006/main">
-                    <a:graphicData uri="http://schemas.openxmlformats.org/drawingml/2006/picture">
-                      <pic:pic xmlns:pic="http://schemas.openxmlformats.org/drawingml/2006/picture">
-                        <pic:nvPicPr>
-                          <pic:cNvPr id="0" name="Picture 2" descr="Logo Universitas Jenderal Soedirman Purwokerto - Logo Gratis"/>
-                          <pic:cNvPicPr>
-                            <a:picLocks noChangeAspect="1" noChangeArrowheads="1"/>
-                          </pic:cNvPicPr>
-                        </pic:nvPicPr>
-                        <pic:blipFill>
-                          <a:blip r:embed="rId6" cstate="print">
-                            <a:extLst>
-                              <a:ext uri="{28A0092B-C50C-407E-A947-70E740481C1C}">
-                                <a14:useLocalDpi xmlns:a14="http://schemas.microsoft.com/office/drawing/2010/main" val="0"/>
-                              </a:ext>
-                            </a:extLst>
-                          </a:blip>
-                          <a:srcRect l="27747" t="7341" r="27397" b="23038"/>
-                          <a:stretch>
-                            <a:fillRect/>
-                          </a:stretch>
-                        </pic:blipFill>
-                        <pic:spPr bwMode="auto">
-                          <a:xfrm>
-                            <a:off x="0" y="0"/>
-                            <a:ext cx="803275" cy="819150"/>
-                          </a:xfrm>
-                          <a:prstGeom prst="rect">
-                            <a:avLst/>
-                          </a:prstGeom>
-                          <a:noFill/>
-                          <a:ln>
-                            <a:noFill/>
-                          </a:ln>
-                        </pic:spPr>
-                      </pic:pic>
-                    </a:graphicData>
-                  </a:graphic>
-                </wp:inline>
-              </w:drawing>
-            </w:r>
-          </w:p>
-        </w:tc>
-        <w:tc>
-          <w:tcPr>
-            <w:tcW w:w="5965" w:type="dxa"/>
-            <w:tcBorders>
-              <w:top w:val="single" w:sz="4" w:space="0" w:color="auto"/>
-              <w:left w:val="single" w:sz="4" w:space="0" w:color="auto"/>
-              <w:bottom w:val="single" w:sz="4" w:space="0" w:color="auto"/>
-              <w:right w:val="single" w:sz="4" w:space="0" w:color="auto"/>
-            </w:tcBorders>
-            <w:shd w:val="clear" w:color="auto" w:fill="FFFFFF"/>
-            <w:vAlign w:val="center"/>
-            <w:hideMark/>
-          </w:tcPr>
-          <w:p>
-            <w:pPr>
-              <w:spacing w:after="60" w:line="256" w:lineRule="auto"/>
-              <w:jc w:val="center"/>
-              <w:rPr>
-                <w:rFonts w:ascii="Arial" w:eastAsia="Calibri" w:hAnsi="Arial" w:cs="Arial"/>
-                <w:kern w:val="0"/>
-                <w:sz w:val="20"/>
-                <w:szCs w:val="20"/>
-                <w:lang w:val="en-US"/>
-                <w14:ligatures w14:val="none"/>
-              </w:rPr>
-            </w:pPr>
-            <w:r>
-              <w:rPr>
-                <w:rFonts w:ascii="Arial" w:eastAsia="Calibri" w:hAnsi="Arial" w:cs="Arial"/>
-                <w:b/>
-                <w:bCs/>
-                <w:kern w:val="0"/>
-                <w:sz w:val="28"/>
-                <w:szCs w:val="28"/>
-                <w:lang w:val="en-US"/>
-                <w14:ligatures w14:val="none"/>
-              </w:rPr>
-              <w:t>UNIVERSITAS JENDERAL SOEDIRMAN</w:t>
-            </w:r>
-          </w:p>
-        </w:tc>
-        <w:tc>
-          <w:tcPr>
-            <w:tcW w:w="2755" w:type="dxa"/>
-            <w:tcBorders>
-              <w:top w:val="single" w:sz="4" w:space="0" w:color="auto"/>
-              <w:left w:val="single" w:sz="4" w:space="0" w:color="auto"/>
-              <w:bottom w:val="single" w:sz="4" w:space="0" w:color="auto"/>
-              <w:right w:val="single" w:sz="4" w:space="0" w:color="auto"/>
-            </w:tcBorders>
-            <w:shd w:val="clear" w:color="auto" w:fill="FFFFFF"/>
-            <w:vAlign w:val="center"/>
-            <w:hideMark/>
-          </w:tcPr>
-          <w:p>
-            <w:pPr>
-              <w:tabs>
-                <w:tab w:val="center" w:pos="3492"/>
-                <w:tab w:val="right" w:pos="6984"/>
-              </w:tabs>
-              <w:spacing w:before="120" w:after="0" w:line="240" w:lineRule="atLeast"/>
-              <w:jc w:val="center"/>
-              <w:rPr>
-                <w:rFonts w:ascii="Arial" w:eastAsia="Calibri" w:hAnsi="Arial" w:cs="Arial"/>
-                <w:noProof/>
-                <w:color w:val="000000"/>
-                <w:kern w:val="0"/>
-                <w:sz w:val="20"/>
-                <w:szCs w:val="20"/>
-                <w:lang w:val="fi-FI"/>
-                <w14:ligatures w14:val="none"/>
-              </w:rPr>
-            </w:pPr>
-            <w:r>
-              <w:rPr>
-                <w:rFonts w:ascii="Arial" w:eastAsia="Calibri" w:hAnsi="Arial" w:cs="Arial"/>
-                <w:noProof/>
-                <w:color w:val="000000"/>
-                <w:kern w:val="0"/>
-                <w:sz w:val="20"/>
-                <w:szCs w:val="20"/>
-                <w:lang w:val="fi-FI"/>
-                <w14:ligatures w14:val="none"/>
-              </w:rPr>
-              <w:t>No : KKA-SA-2024</w:t>
-            </w:r>
-          </w:p>
-          <w:p>
-            <w:pPr>
-              <w:tabs>
-                <w:tab w:val="center" w:pos="3492"/>
-                <w:tab w:val="right" w:pos="6984"/>
-              </w:tabs>
-              <w:spacing w:before="120" w:after="0" w:line="240" w:lineRule="atLeast"/>
-              <w:jc w:val="center"/>
-              <w:rPr>
-                <w:rFonts w:ascii="Arial" w:eastAsia="Calibri" w:hAnsi="Arial" w:cs="Arial"/>
-                <w:noProof/>
-                <w:color w:val="000000"/>
-                <w:kern w:val="0"/>
-                <w:sz w:val="20"/>
-                <w:szCs w:val="20"/>
-                <w:lang w:val="fi-FI"/>
-                <w14:ligatures w14:val="none"/>
-              </w:rPr>
-            </w:pPr>
-            <w:r>
-              <w:rPr>
-                <w:rFonts w:ascii="Arial" w:eastAsia="Calibri" w:hAnsi="Arial" w:cs="Arial"/>
-                <w:noProof/>
-                <w:color w:val="000000"/>
-                <w:kern w:val="0"/>
-                <w:sz w:val="20"/>
-                <w:szCs w:val="20"/>
-                <w:lang w:val="fi-FI"/>
-                <w14:ligatures w14:val="none"/>
-              </w:rPr>
-              <w:t>Tgl pemberlakuan: 22 Juli 2024</w:t>
-            </w:r>
-          </w:p>
-        </w:tc>
-      </w:tr>
-      <w:tr>
-        <w:trPr>
-          <w:trHeight w:val="580"/>
-        </w:trPr>
-        <w:tc>
-          <w:tcPr>
-            <w:tcW w:w="10093" w:type="dxa"/>
-            <w:gridSpan w:val="3"/>
-            <w:tcBorders>
-              <w:top w:val="single" w:sz="4" w:space="0" w:color="auto"/>
-              <w:left w:val="single" w:sz="4" w:space="0" w:color="auto"/>
-              <w:bottom w:val="single" w:sz="4" w:space="0" w:color="auto"/>
-              <w:right w:val="single" w:sz="4" w:space="0" w:color="auto"/>
-            </w:tcBorders>
-            <w:shd w:val="clear" w:color="auto" w:fill="FFFFFF"/>
-            <w:vAlign w:val="center"/>
-            <w:hideMark/>
-          </w:tcPr>
-          <w:p>
-            <w:pPr>
-              <w:spacing w:after="0" w:line="256" w:lineRule="auto"/>
-              <w:jc w:val="center"/>
-              <w:rPr>
-                <w:rFonts w:ascii="Arial" w:eastAsia="Calibri" w:hAnsi="Arial" w:cs="Arial"/>
-                <w:b/>
-                <w:noProof/>
-                <w:kern w:val="0"/>
-                <w:lang w:val="en-AU"/>
-                <w14:ligatures w14:val="none"/>
-              </w:rPr>
-            </w:pPr>
-            <w:r>
-              <w:rPr>
-                <w:rFonts w:ascii="Arial" w:eastAsia="Calibri" w:hAnsi="Arial" w:cs="Arial"/>
-                <w:b/>
-                <w:noProof/>
-                <w:kern w:val="0"/>
-                <w:lang w:val="en-AU"/>
-                <w14:ligatures w14:val="none"/>
-              </w:rPr>
-              <w:t>PROGRAM KERJA AUDIT MUTU INTERNAL</w:t>
-            </w:r>
-          </w:p>
-          <w:p>
-            <w:pPr>
-              <w:spacing w:after="0" w:line="256" w:lineRule="auto"/>
-              <w:jc w:val="center"/>
-              <w:rPr>
-                <w:rFonts w:ascii="Arial" w:eastAsia="Calibri" w:hAnsi="Arial" w:cs="Arial"/>
-                <w:noProof/>
-                <w:kern w:val="0"/>
-                <w:sz w:val="20"/>
-                <w:szCs w:val="20"/>
-                <w:lang w:val="en-AU"/>
-                <w14:ligatures w14:val="none"/>
-              </w:rPr>
-            </w:pPr>
-            <w:r>
-              <w:rPr>
-                <w:rFonts w:ascii="Arial" w:eastAsia="Calibri" w:hAnsi="Arial" w:cs="Arial"/>
-                <w:b/>
-                <w:noProof/>
-                <w:kern w:val="0"/>
-                <w:lang w:val="en-AU"/>
-                <w14:ligatures w14:val="none"/>
-              </w:rPr>
-              <w:t>BIDANG AKADEMIK</w:t>
-            </w:r>
-          </w:p>
-        </w:tc>
-      </w:tr>
-    </w:tbl>
-    <w:p>
-      <w:pPr>
-        <w:spacing w:after="0" w:line="256" w:lineRule="auto"/>
-        <w:rPr>
-          <w:rFonts w:ascii="Arial" w:eastAsia="Calibri" w:hAnsi="Arial" w:cs="Arial"/>
-          <w:kern w:val="0"/>
-          <w:sz w:val="20"/>
-          <w:szCs w:val="20"/>
-          <w:lang w:val="en-AU"/>
-          <w14:ligatures w14:val="none"/>
-        </w:rPr>
-      </w:pPr>
-    </w:p>
-    <w:p>
-      <w:pPr>
-        <w:spacing w:after="0" w:line="256" w:lineRule="auto"/>
-        <w:rPr>
-          <w:rFonts w:ascii="Arial" w:eastAsia="Calibri" w:hAnsi="Arial" w:cs="Arial"/>
-          <w:kern w:val="0"/>
-          <w:sz w:val="20"/>
-          <w:szCs w:val="20"/>
-          <w:lang w:val="en-AU"/>
-          <w14:ligatures w14:val="none"/>
-        </w:rPr>
-      </w:pPr>
-    </w:p>
-    <w:tbl>
-      <w:tblPr>
-        <w:tblW w:w="10065" w:type="dxa"/>
-        <w:tblInd w:w="-431" w:type="dxa"/>
-        <w:tblBorders>
-          <w:top w:val="single" w:sz="4" w:space="0" w:color="000000"/>
-          <w:left w:val="single" w:sz="4" w:space="0" w:color="000000"/>
-          <w:bottom w:val="single" w:sz="4" w:space="0" w:color="000000"/>
-          <w:right w:val="single" w:sz="4" w:space="0" w:color="000000"/>
-          <w:insideH w:val="single" w:sz="4" w:space="0" w:color="000000"/>
-          <w:insideV w:val="single" w:sz="4" w:space="0" w:color="000000"/>
-        </w:tblBorders>
-        <w:tblLook w:val="04A0" w:firstRow="1" w:lastRow="0" w:firstColumn="1" w:lastColumn="0" w:noHBand="0" w:noVBand="1"/>
-      </w:tblPr>
-      <w:tblGrid>
-        <w:gridCol w:w="3120"/>
-        <w:gridCol w:w="6945"/>
-      </w:tblGrid>
-      <w:tr>
-        <w:trPr>
-          <w:trHeight w:val="260"/>
-        </w:trPr>
-        <w:tc>
-          <w:tcPr>
-            <w:tcW w:w="3120" w:type="dxa"/>
-            <w:tcBorders>
-              <w:top w:val="single" w:sz="4" w:space="0" w:color="000000"/>
-              <w:left w:val="single" w:sz="4" w:space="0" w:color="000000"/>
-              <w:bottom w:val="single" w:sz="4" w:space="0" w:color="000000"/>
-              <w:right w:val="single" w:sz="4" w:space="0" w:color="000000"/>
-            </w:tcBorders>
-            <w:shd w:val="clear" w:color="auto" w:fill="BDD6EE"/>
-            <w:hideMark/>
-          </w:tcPr>
-          <w:p>
-            <w:pPr>
-              <w:spacing w:after="0" w:line="256" w:lineRule="auto"/>
-              <w:rPr>
-                <w:rFonts w:ascii="Arial" w:eastAsia="Calibri" w:hAnsi="Arial" w:cs="Arial"/>
-                <w:b/>
-                <w:bCs/>
-                <w:kern w:val="0"/>
-                <w:sz w:val="20"/>
-                <w:szCs w:val="20"/>
-                <w:lang w:val="en-AU"/>
-                <w14:ligatures w14:val="none"/>
-              </w:rPr>
-            </w:pPr>
-            <w:proofErr w:type="spellStart"/>
-            <w:r>
-              <w:rPr>
-                <w:rFonts w:ascii="Arial" w:eastAsia="Calibri" w:hAnsi="Arial" w:cs="Arial"/>
-                <w:b/>
-                <w:bCs/>
-                <w:kern w:val="0"/>
-                <w:sz w:val="20"/>
-                <w:szCs w:val="20"/>
-                <w:lang w:val="en-AU"/>
-                <w14:ligatures w14:val="none"/>
-              </w:rPr>
-              <w:t>Tanggal</w:t>
-            </w:r>
-            <w:proofErr w:type="spellEnd"/>
-            <w:r>
-              <w:rPr>
-                <w:rFonts w:ascii="Arial" w:eastAsia="Calibri" w:hAnsi="Arial" w:cs="Arial"/>
-                <w:b/>
-                <w:bCs/>
-                <w:kern w:val="0"/>
-                <w:sz w:val="20"/>
-                <w:szCs w:val="20"/>
-                <w:lang w:val="en-AU"/>
-                <w14:ligatures w14:val="none"/>
-              </w:rPr>
-              <w:t xml:space="preserve"> Audit</w:t>
-            </w:r>
-          </w:p>
-        </w:tc>
-        <w:tc>
-          <w:tcPr>
-            <w:tcW w:w="6945" w:type="dxa"/>
-            <w:tcBorders>
-              <w:top w:val="single" w:sz="4" w:space="0" w:color="000000"/>
-              <w:left w:val="single" w:sz="4" w:space="0" w:color="000000"/>
-              <w:bottom w:val="single" w:sz="4" w:space="0" w:color="000000"/>
-              <w:right w:val="single" w:sz="4" w:space="0" w:color="000000"/>
-            </w:tcBorders>
-            <w:hideMark/>
-          </w:tcPr>
-          <w:p>
-            <w:pPr>
-              <w:spacing w:after="0" w:line="256" w:lineRule="auto"/>
-              <w:rPr>
-                <w:rFonts w:ascii="Arial" w:eastAsia="Calibri" w:hAnsi="Arial" w:cs="Arial"/>
-                <w:kern w:val="0"/>
-                <w:sz w:val="20"/>
-                <w:szCs w:val="20"/>
-                <w:lang w:val="en-AU"/>
-                <w14:ligatures w14:val="none"/>
-              </w:rPr>
-            </w:pPr>
-            <w:r>
-              <w:rPr>
-                <w:rFonts w:ascii="Arial" w:eastAsia="Calibri" w:hAnsi="Arial" w:cs="Arial"/>
-                <w:kern w:val="0"/>
-                <w:sz w:val="20"/>
-                <w:szCs w:val="20"/>
-                <w:lang w:val="en-AU"/>
-                <w14:ligatures w14:val="none"/>
-              </w:rPr>
-              <w:t>${</w:t>
-            </w:r>
-            <w:proofErr w:type="spellStart"/>
-            <w:r>
-              <w:rPr>
-                <w:rFonts w:ascii="Arial" w:eastAsia="Calibri" w:hAnsi="Arial" w:cs="Arial"/>
-                <w:kern w:val="0"/>
-                <w:sz w:val="20"/>
-                <w:szCs w:val="20"/>
-                <w:lang w:val="en-AU"/>
-                <w14:ligatures w14:val="none"/>
-              </w:rPr>
-              <w:t>date</w:t>
-            </w:r>
-            <w:r>
-              <w:rPr>
-                <w:rFonts w:ascii="Arial" w:eastAsia="Calibri" w:hAnsi="Arial" w:cs="Arial"/>
-                <w:kern w:val="0"/>
-                <w:sz w:val="20"/>
-                <w:szCs w:val="20"/>
-                <w:lang w:val="en-AU"/>
-                <w14:ligatures w14:val="none"/>
-              </w:rPr>
-              <w:t>DT</w:t>
-            </w:r>
-            <w:proofErr w:type="spellEnd"/>
-            <w:r>
-              <w:rPr>
-                <w:rFonts w:ascii="Arial" w:eastAsia="Calibri" w:hAnsi="Arial" w:cs="Arial"/>
-                <w:kern w:val="0"/>
-                <w:sz w:val="20"/>
-                <w:szCs w:val="20"/>
-                <w:lang w:val="en-AU"/>
-                <w14:ligatures w14:val="none"/>
-              </w:rPr>
-              <w:t>}</w:t>
-            </w:r>
-          </w:p>
-        </w:tc>
-      </w:tr>
-      <w:tr>
-        <w:trPr>
-          <w:trHeight w:val="260"/>
-        </w:trPr>
-        <w:tc>
-          <w:tcPr>
-            <w:tcW w:w="3120" w:type="dxa"/>
-            <w:tcBorders>
-              <w:top w:val="single" w:sz="4" w:space="0" w:color="000000"/>
-              <w:left w:val="single" w:sz="4" w:space="0" w:color="000000"/>
-              <w:bottom w:val="single" w:sz="4" w:space="0" w:color="000000"/>
-              <w:right w:val="single" w:sz="4" w:space="0" w:color="000000"/>
-            </w:tcBorders>
-            <w:shd w:val="clear" w:color="auto" w:fill="BDD6EE"/>
-            <w:hideMark/>
-          </w:tcPr>
-          <w:p>
-            <w:pPr>
-              <w:spacing w:after="0" w:line="256" w:lineRule="auto"/>
-              <w:rPr>
-                <w:rFonts w:ascii="Arial" w:eastAsia="Calibri" w:hAnsi="Arial" w:cs="Arial"/>
-                <w:b/>
-                <w:bCs/>
-                <w:kern w:val="0"/>
-                <w:sz w:val="20"/>
-                <w:szCs w:val="20"/>
-                <w:lang w:val="en-AU"/>
-                <w14:ligatures w14:val="none"/>
-              </w:rPr>
-            </w:pPr>
-            <w:proofErr w:type="spellStart"/>
-            <w:r>
-              <w:rPr>
-                <w:rFonts w:ascii="Arial" w:eastAsia="Calibri" w:hAnsi="Arial" w:cs="Arial"/>
-                <w:b/>
-                <w:bCs/>
-                <w:kern w:val="0"/>
-                <w:sz w:val="20"/>
-                <w:szCs w:val="20"/>
-                <w:lang w:val="en-AU"/>
-                <w14:ligatures w14:val="none"/>
-              </w:rPr>
-              <w:t>Auditan</w:t>
-            </w:r>
-            <w:proofErr w:type="spellEnd"/>
-          </w:p>
-        </w:tc>
-        <w:tc>
-          <w:tcPr>
-            <w:tcW w:w="6945" w:type="dxa"/>
-            <w:tcBorders>
-              <w:top w:val="single" w:sz="4" w:space="0" w:color="000000"/>
-              <w:left w:val="single" w:sz="4" w:space="0" w:color="000000"/>
-              <w:bottom w:val="single" w:sz="4" w:space="0" w:color="000000"/>
-              <w:right w:val="single" w:sz="4" w:space="0" w:color="000000"/>
-            </w:tcBorders>
-            <w:hideMark/>
-          </w:tcPr>
-          <w:p>
-            <w:pPr>
-              <w:spacing w:after="0" w:line="256" w:lineRule="auto"/>
-              <w:rPr>
-                <w:rFonts w:ascii="Arial" w:eastAsia="Calibri" w:hAnsi="Arial" w:cs="Arial"/>
-                <w:kern w:val="0"/>
-                <w:sz w:val="20"/>
-                <w:szCs w:val="20"/>
-                <w:lang w:val="en-AU"/>
-                <w14:ligatures w14:val="none"/>
-              </w:rPr>
-            </w:pPr>
-            <w:r>
-              <w:rPr>
-                <w:rFonts w:ascii="Arial" w:eastAsia="Calibri" w:hAnsi="Arial" w:cs="Arial"/>
-                <w:kern w:val="0"/>
-                <w:sz w:val="20"/>
-                <w:szCs w:val="20"/>
-                <w:lang w:val="en-AU"/>
-                <w14:ligatures w14:val="none"/>
-              </w:rPr>
-              <w:t>${unit}</w:t>
-            </w:r>
-          </w:p>
-        </w:tc>
-      </w:tr>
-      <w:tr>
-        <w:trPr>
-          <w:trHeight w:val="260"/>
-        </w:trPr>
-        <w:tc>
-          <w:tcPr>
-            <w:tcW w:w="3120" w:type="dxa"/>
-            <w:tcBorders>
-              <w:top w:val="single" w:sz="4" w:space="0" w:color="000000"/>
-              <w:left w:val="single" w:sz="4" w:space="0" w:color="000000"/>
-              <w:bottom w:val="single" w:sz="4" w:space="0" w:color="000000"/>
-              <w:right w:val="single" w:sz="4" w:space="0" w:color="000000"/>
-            </w:tcBorders>
-            <w:shd w:val="clear" w:color="auto" w:fill="BDD6EE"/>
-            <w:hideMark/>
-          </w:tcPr>
-          <w:p>
-            <w:pPr>
-              <w:spacing w:line="256" w:lineRule="auto"/>
-              <w:rPr>
-                <w:rFonts w:ascii="Arial" w:eastAsia="Calibri" w:hAnsi="Arial" w:cs="Arial"/>
-                <w:b/>
-                <w:bCs/>
-                <w:kern w:val="0"/>
-                <w:sz w:val="20"/>
-                <w:szCs w:val="20"/>
-                <w:lang w:val="en-AU"/>
-                <w14:ligatures w14:val="none"/>
-              </w:rPr>
-            </w:pPr>
-            <w:r>
-              <w:rPr>
-                <w:rFonts w:ascii="Arial" w:eastAsia="Calibri" w:hAnsi="Arial" w:cs="Arial"/>
-                <w:b/>
-                <w:bCs/>
-                <w:kern w:val="0"/>
-                <w:sz w:val="20"/>
-                <w:szCs w:val="20"/>
-                <w:lang w:val="en-AU"/>
-                <w14:ligatures w14:val="none"/>
-              </w:rPr>
-              <w:t>Auditor</w:t>
-            </w:r>
-          </w:p>
-        </w:tc>
-        <w:tc>
-          <w:tcPr>
-            <w:tcW w:w="6945" w:type="dxa"/>
-            <w:tcBorders>
-              <w:top w:val="single" w:sz="4" w:space="0" w:color="000000"/>
-              <w:left w:val="single" w:sz="4" w:space="0" w:color="000000"/>
-              <w:bottom w:val="single" w:sz="4" w:space="0" w:color="000000"/>
-              <w:right w:val="single" w:sz="4" w:space="0" w:color="000000"/>
-            </w:tcBorders>
-            <w:hideMark/>
-          </w:tcPr>
-          <w:p>
-            <w:pPr>
-              <w:spacing w:after="0" w:line="256" w:lineRule="auto"/>
-              <w:rPr>
-                <w:rFonts w:ascii="Arial" w:eastAsia="Calibri" w:hAnsi="Arial" w:cs="Arial"/>
-                <w:kern w:val="0"/>
-                <w:sz w:val="20"/>
-                <w:szCs w:val="20"/>
-                <w:lang w:val="en-AU"/>
-                <w14:ligatures w14:val="none"/>
-              </w:rPr>
-            </w:pPr>
-            <w:r>
-              <w:rPr>
-                <w:rFonts w:ascii="Arial" w:eastAsia="Calibri" w:hAnsi="Arial" w:cs="Arial"/>
-                <w:kern w:val="0"/>
-                <w:sz w:val="20"/>
-                <w:szCs w:val="20"/>
-                <w:lang w:val="en-AU"/>
-                <w14:ligatures w14:val="none"/>
-              </w:rPr>
-              <w:t>${auditor</w:t>
-            </w:r>
-            <w:r>
-              <w:rPr>
-                <w:rFonts w:ascii="Arial" w:eastAsia="Calibri" w:hAnsi="Arial" w:cs="Arial"/>
-                <w:kern w:val="0"/>
-                <w:sz w:val="20"/>
-                <w:szCs w:val="20"/>
-                <w:lang w:val="en-AU"/>
-                <w14:ligatures w14:val="none"/>
-              </w:rPr>
-              <w:t>DT</w:t>
-            </w:r>
-            <w:r>
-              <w:rPr>
-                <w:rFonts w:ascii="Arial" w:eastAsia="Calibri" w:hAnsi="Arial" w:cs="Arial"/>
-                <w:kern w:val="0"/>
-                <w:sz w:val="20"/>
-                <w:szCs w:val="20"/>
-                <w:lang w:val="en-AU"/>
-                <w14:ligatures w14:val="none"/>
-              </w:rPr>
-              <w:t>#1}</w:t>
-            </w:r>
-          </w:p>
-          <w:p>
-            <w:pPr>
-              <w:spacing w:after="0" w:line="256" w:lineRule="auto"/>
-              <w:rPr>
-                <w:rFonts w:ascii="Arial" w:eastAsia="Calibri" w:hAnsi="Arial" w:cs="Arial"/>
-                <w:kern w:val="0"/>
-                <w:sz w:val="20"/>
-                <w:szCs w:val="20"/>
-                <w:lang w:val="en-AU"/>
-                <w14:ligatures w14:val="none"/>
-              </w:rPr>
-            </w:pPr>
-            <w:r>
-              <w:rPr>
-                <w:rFonts w:ascii="Arial" w:eastAsia="Calibri" w:hAnsi="Arial" w:cs="Arial"/>
-                <w:kern w:val="0"/>
-                <w:sz w:val="20"/>
-                <w:szCs w:val="20"/>
-                <w:lang w:val="en-AU"/>
-                <w14:ligatures w14:val="none"/>
-              </w:rPr>
-              <w:t>${auditor</w:t>
-            </w:r>
-            <w:r>
-              <w:rPr>
-                <w:rFonts w:ascii="Arial" w:eastAsia="Calibri" w:hAnsi="Arial" w:cs="Arial"/>
-                <w:kern w:val="0"/>
-                <w:sz w:val="20"/>
-                <w:szCs w:val="20"/>
-                <w:lang w:val="en-AU"/>
-                <w14:ligatures w14:val="none"/>
-              </w:rPr>
-              <w:t>DT</w:t>
-            </w:r>
-            <w:r>
-              <w:rPr>
-                <w:rFonts w:ascii="Arial" w:eastAsia="Calibri" w:hAnsi="Arial" w:cs="Arial"/>
-                <w:kern w:val="0"/>
-                <w:sz w:val="20"/>
-                <w:szCs w:val="20"/>
-                <w:lang w:val="en-AU"/>
-                <w14:ligatures w14:val="none"/>
-              </w:rPr>
-              <w:t>#2}</w:t>
-            </w:r>
-          </w:p>
-          <w:p>
-            <w:pPr>
-              <w:spacing w:after="0" w:line="256" w:lineRule="auto"/>
-              <w:rPr>
-                <w:rFonts w:ascii="Arial" w:eastAsia="Calibri" w:hAnsi="Arial" w:cs="Arial"/>
-                <w:kern w:val="0"/>
-                <w:sz w:val="20"/>
-                <w:szCs w:val="20"/>
-                <w:lang w:val="en-AU"/>
-                <w14:ligatures w14:val="none"/>
-              </w:rPr>
-            </w:pPr>
-            <w:r>
-              <w:rPr>
-                <w:rFonts w:ascii="Arial" w:eastAsia="Calibri" w:hAnsi="Arial" w:cs="Arial"/>
-                <w:kern w:val="0"/>
-                <w:sz w:val="20"/>
-                <w:szCs w:val="20"/>
-                <w:lang w:val="en-AU"/>
-                <w14:ligatures w14:val="none"/>
-              </w:rPr>
-              <w:t>${auditor</w:t>
-            </w:r>
-            <w:r>
-              <w:rPr>
-                <w:rFonts w:ascii="Arial" w:eastAsia="Calibri" w:hAnsi="Arial" w:cs="Arial"/>
-                <w:kern w:val="0"/>
-                <w:sz w:val="20"/>
-                <w:szCs w:val="20"/>
-                <w:lang w:val="en-AU"/>
-                <w14:ligatures w14:val="none"/>
-              </w:rPr>
-              <w:t>DT</w:t>
-            </w:r>
-            <w:r>
-              <w:rPr>
-                <w:rFonts w:ascii="Arial" w:eastAsia="Calibri" w:hAnsi="Arial" w:cs="Arial"/>
-                <w:kern w:val="0"/>
-                <w:sz w:val="20"/>
-                <w:szCs w:val="20"/>
-                <w:lang w:val="en-AU"/>
-                <w14:ligatures w14:val="none"/>
-              </w:rPr>
-              <w:t>#3}</w:t>
-            </w:r>
-          </w:p>
-        </w:tc>
-      </w:tr>
-    </w:tbl>
-    <w:p>
-      <w:pPr>
-        <w:spacing w:after="0" w:line="256" w:lineRule="auto"/>
-        <w:rPr>
-          <w:rFonts w:ascii="Arial" w:eastAsia="Calibri" w:hAnsi="Arial" w:cs="Arial"/>
-          <w:kern w:val="0"/>
-          <w:sz w:val="20"/>
-          <w:szCs w:val="20"/>
-          <w:lang w:val="en-AU"/>
-          <w14:ligatures w14:val="none"/>
-        </w:rPr>
-      </w:pPr>
-    </w:p>
-    <w:p>
-      <w:pPr>
-        <w:spacing w:after="0" w:line="256" w:lineRule="auto"/>
-        <w:jc w:val="center"/>
-        <w:rPr>
-          <w:rFonts w:ascii="Arial" w:eastAsia="Calibri" w:hAnsi="Arial" w:cs="Arial"/>
-          <w:kern w:val="0"/>
-          <w:sz w:val="20"/>
-          <w:szCs w:val="20"/>
-          <w:lang w:val="en-AU"/>
-          <w14:ligatures w14:val="none"/>
-        </w:rPr>
-      </w:pPr>
-    </w:p>
-    <w:tbl>
-      <w:tblPr>
-        <w:tblStyle w:val="TableGrid1"/>
-        <w:tblW w:w="10065" w:type="dxa"/>
-        <w:tblInd w:w="-431" w:type="dxa"/>
-        <w:tblLook w:val="04A0" w:firstRow="1" w:lastRow="0" w:firstColumn="1" w:lastColumn="0" w:noHBand="0" w:noVBand="1"/>
-      </w:tblPr>
-      <w:tblGrid>
-        <w:gridCol w:w="950"/>
-        <w:gridCol w:w="1162"/>
-        <w:gridCol w:w="3986"/>
-        <w:gridCol w:w="3967"/>
-      </w:tblGrid>
-      <w:tr>
-        <w:tc>
-          <w:tcPr>
-            <w:tcW w:w="684" w:type="dxa"/>
-            <w:tcBorders>
-              <w:top w:val="single" w:sz="4" w:space="0" w:color="auto"/>
-              <w:left w:val="single" w:sz="4" w:space="0" w:color="auto"/>
-              <w:bottom w:val="single" w:sz="4" w:space="0" w:color="auto"/>
-              <w:right w:val="single" w:sz="4" w:space="0" w:color="auto"/>
-            </w:tcBorders>
-            <w:shd w:val="clear" w:color="auto" w:fill="BDD6EE"/>
-            <w:vAlign w:val="center"/>
-            <w:hideMark/>
-          </w:tcPr>
-          <w:p>
-            <w:pPr>
-              <w:jc w:val="center"/>
-              <w:rPr>
-                <w:rFonts w:ascii="Arial" w:hAnsi="Arial" w:cs="Arial"/>
-                <w:b/>
-                <w:bCs/>
-                <w:sz w:val="20"/>
-                <w:szCs w:val="20"/>
-              </w:rPr>
-            </w:pPr>
-            <w:r>
-              <w:rPr>
-                <w:rFonts w:ascii="Arial" w:hAnsi="Arial" w:cs="Arial"/>
-                <w:b/>
-                <w:bCs/>
-                <w:sz w:val="20"/>
-                <w:szCs w:val="20"/>
-              </w:rPr>
-              <w:t>No.</w:t>
-            </w:r>
-          </w:p>
-        </w:tc>
-        <w:tc>
-          <w:tcPr>
-            <w:tcW w:w="1160" w:type="dxa"/>
-            <w:tcBorders>
-              <w:top w:val="single" w:sz="4" w:space="0" w:color="auto"/>
-              <w:left w:val="single" w:sz="4" w:space="0" w:color="auto"/>
-              <w:bottom w:val="single" w:sz="4" w:space="0" w:color="auto"/>
-              <w:right w:val="single" w:sz="4" w:space="0" w:color="auto"/>
-            </w:tcBorders>
-            <w:shd w:val="clear" w:color="auto" w:fill="BDD6EE"/>
-            <w:vAlign w:val="center"/>
-            <w:hideMark/>
-          </w:tcPr>
-          <w:p>
-            <w:pPr>
-              <w:jc w:val="center"/>
-              <w:rPr>
-                <w:rFonts w:ascii="Arial" w:hAnsi="Arial" w:cs="Arial"/>
-                <w:b/>
-                <w:bCs/>
-                <w:sz w:val="20"/>
-                <w:szCs w:val="20"/>
-              </w:rPr>
-            </w:pPr>
-            <w:proofErr w:type="spellStart"/>
-            <w:r>
-              <w:rPr>
-                <w:rFonts w:ascii="Arial" w:hAnsi="Arial" w:cs="Arial"/>
-                <w:b/>
-                <w:bCs/>
-                <w:sz w:val="20"/>
-                <w:szCs w:val="20"/>
-              </w:rPr>
-              <w:t>Referensi</w:t>
-            </w:r>
-            <w:proofErr w:type="spellEnd"/>
-            <w:r>
-              <w:rPr>
-                <w:rFonts w:ascii="Arial" w:hAnsi="Arial" w:cs="Arial"/>
-                <w:b/>
-                <w:bCs/>
-                <w:sz w:val="20"/>
-                <w:szCs w:val="20"/>
-              </w:rPr>
-              <w:t xml:space="preserve"> (</w:t>
-            </w:r>
-            <w:proofErr w:type="spellStart"/>
-            <w:r>
-              <w:rPr>
-                <w:rFonts w:ascii="Arial" w:hAnsi="Arial" w:cs="Arial"/>
-                <w:b/>
-                <w:bCs/>
-                <w:sz w:val="20"/>
-                <w:szCs w:val="20"/>
-              </w:rPr>
-              <w:t>standar</w:t>
-            </w:r>
-            <w:proofErr w:type="spellEnd"/>
-            <w:r>
-              <w:rPr>
-                <w:rFonts w:ascii="Arial" w:hAnsi="Arial" w:cs="Arial"/>
-                <w:b/>
-                <w:bCs/>
-                <w:sz w:val="20"/>
-                <w:szCs w:val="20"/>
-              </w:rPr>
-              <w:t>)</w:t>
-            </w:r>
-          </w:p>
-        </w:tc>
-        <w:tc>
-          <w:tcPr>
-            <w:tcW w:w="4111" w:type="dxa"/>
-            <w:tcBorders>
-              <w:top w:val="single" w:sz="4" w:space="0" w:color="auto"/>
-              <w:left w:val="single" w:sz="4" w:space="0" w:color="auto"/>
-              <w:bottom w:val="single" w:sz="4" w:space="0" w:color="auto"/>
-              <w:right w:val="single" w:sz="4" w:space="0" w:color="auto"/>
-            </w:tcBorders>
-            <w:shd w:val="clear" w:color="auto" w:fill="BDD6EE"/>
-            <w:vAlign w:val="center"/>
-            <w:hideMark/>
-          </w:tcPr>
-          <w:p>
-            <w:pPr>
-              <w:jc w:val="center"/>
-              <w:rPr>
-                <w:rFonts w:ascii="Arial" w:hAnsi="Arial" w:cs="Arial"/>
-                <w:b/>
-                <w:bCs/>
-                <w:sz w:val="20"/>
-                <w:szCs w:val="20"/>
-              </w:rPr>
-            </w:pPr>
-            <w:proofErr w:type="spellStart"/>
-            <w:r>
-              <w:rPr>
-                <w:rFonts w:ascii="Arial" w:hAnsi="Arial" w:cs="Arial"/>
-                <w:b/>
-                <w:bCs/>
-                <w:sz w:val="20"/>
-                <w:szCs w:val="20"/>
-              </w:rPr>
-              <w:t>Pertanyaan</w:t>
-            </w:r>
-            <w:proofErr w:type="spellEnd"/>
-          </w:p>
-        </w:tc>
-        <w:tc>
-          <w:tcPr>
-            <w:tcW w:w="4110" w:type="dxa"/>
-            <w:tcBorders>
-              <w:top w:val="single" w:sz="4" w:space="0" w:color="auto"/>
-              <w:left w:val="single" w:sz="4" w:space="0" w:color="auto"/>
-              <w:bottom w:val="single" w:sz="4" w:space="0" w:color="auto"/>
-              <w:right w:val="single" w:sz="4" w:space="0" w:color="auto"/>
-            </w:tcBorders>
-            <w:shd w:val="clear" w:color="auto" w:fill="BDD6EE"/>
-            <w:vAlign w:val="center"/>
-            <w:hideMark/>
-          </w:tcPr>
-          <w:p>
-            <w:pPr>
-              <w:jc w:val="center"/>
-              <w:rPr>
-                <w:rFonts w:ascii="Arial" w:hAnsi="Arial" w:cs="Arial"/>
-                <w:b/>
-                <w:bCs/>
-                <w:sz w:val="20"/>
-                <w:szCs w:val="20"/>
-              </w:rPr>
-            </w:pPr>
-            <w:proofErr w:type="spellStart"/>
-            <w:r>
-              <w:rPr>
-                <w:rFonts w:ascii="Arial" w:hAnsi="Arial" w:cs="Arial"/>
-                <w:b/>
-                <w:bCs/>
-                <w:sz w:val="20"/>
-                <w:szCs w:val="20"/>
-              </w:rPr>
-              <w:t>Keterangan</w:t>
-            </w:r>
-            <w:proofErr w:type="spellEnd"/>
-          </w:p>
-        </w:tc>
-      </w:tr>
-      <w:tr>
-        <w:tc>
-          <w:tcPr>
-            <w:tcW w:w="684" w:type="dxa"/>
-            <w:tcBorders>
-              <w:top w:val="single" w:sz="4" w:space="0" w:color="auto"/>
-              <w:left w:val="single" w:sz="4" w:space="0" w:color="auto"/>
-              <w:bottom w:val="single" w:sz="4" w:space="0" w:color="auto"/>
-              <w:right w:val="single" w:sz="4" w:space="0" w:color="auto"/>
-            </w:tcBorders>
-            <w:hideMark/>
-          </w:tcPr>
-          <w:p>
-            <w:pPr>
-              <w:jc w:val="center"/>
-              <w:rPr>
-                <w:rFonts w:ascii="Arial" w:hAnsi="Arial" w:cs="Arial"/>
-                <w:sz w:val="20"/>
-                <w:szCs w:val="20"/>
-              </w:rPr>
-            </w:pPr>
-            <w:r>
-              <w:rPr>
-                <w:rFonts w:ascii="Arial" w:hAnsi="Arial" w:cs="Arial"/>
-                <w:sz w:val="20"/>
-                <w:szCs w:val="20"/>
-              </w:rPr>
-              <w:t>${</w:t>
-            </w:r>
-            <w:proofErr w:type="spellStart"/>
-            <w:r>
-              <w:rPr>
-                <w:rFonts w:ascii="Arial" w:hAnsi="Arial" w:cs="Arial"/>
-                <w:sz w:val="20"/>
-                <w:szCs w:val="20"/>
-              </w:rPr>
-              <w:t>no</w:t>
-            </w:r>
-            <w:r>
-              <w:rPr>
-                <w:rFonts w:ascii="Arial" w:hAnsi="Arial" w:cs="Arial"/>
-                <w:sz w:val="20"/>
-                <w:szCs w:val="20"/>
-              </w:rPr>
-              <w:t>DT</w:t>
-            </w:r>
-            <w:proofErr w:type="spellEnd"/>
-            <w:r>
-              <w:rPr>
-                <w:rFonts w:ascii="Arial" w:hAnsi="Arial" w:cs="Arial"/>
-                <w:sz w:val="20"/>
-                <w:szCs w:val="20"/>
-              </w:rPr>
-              <w:t>}</w:t>
-            </w:r>
-          </w:p>
-        </w:tc>
-        <w:tc>
-          <w:tcPr>
-            <w:tcW w:w="1160" w:type="dxa"/>
-            <w:tcBorders>
-              <w:top w:val="single" w:sz="4" w:space="0" w:color="auto"/>
-              <w:left w:val="single" w:sz="4" w:space="0" w:color="auto"/>
-              <w:bottom w:val="single" w:sz="4" w:space="0" w:color="auto"/>
-              <w:right w:val="single" w:sz="4" w:space="0" w:color="auto"/>
-            </w:tcBorders>
-            <w:hideMark/>
-          </w:tcPr>
-          <w:p>
-            <w:pPr>
-              <w:jc w:val="center"/>
-              <w:rPr>
-                <w:rFonts w:ascii="Arial" w:hAnsi="Arial" w:cs="Arial"/>
-                <w:sz w:val="20"/>
-                <w:szCs w:val="20"/>
-              </w:rPr>
-            </w:pPr>
-            <w:r>
-              <w:rPr>
-                <w:rFonts w:ascii="Arial" w:hAnsi="Arial" w:cs="Arial"/>
-                <w:sz w:val="20"/>
-                <w:szCs w:val="20"/>
-              </w:rPr>
-              <w:t>${</w:t>
-            </w:r>
-            <w:proofErr w:type="spellStart"/>
-            <w:r>
-              <w:rPr>
-                <w:rFonts w:ascii="Arial" w:hAnsi="Arial" w:cs="Arial"/>
-                <w:sz w:val="20"/>
-                <w:szCs w:val="20"/>
-              </w:rPr>
-              <w:t>kode</w:t>
-            </w:r>
-            <w:r>
-              <w:rPr>
-                <w:rFonts w:ascii="Arial" w:hAnsi="Arial" w:cs="Arial"/>
-                <w:sz w:val="20"/>
-                <w:szCs w:val="20"/>
-              </w:rPr>
-              <w:t>DT</w:t>
-            </w:r>
-            <w:proofErr w:type="spellEnd"/>
-            <w:r>
-              <w:rPr>
-                <w:rFonts w:ascii="Arial" w:hAnsi="Arial" w:cs="Arial"/>
-                <w:sz w:val="20"/>
-                <w:szCs w:val="20"/>
-              </w:rPr>
-              <w:t>}</w:t>
-            </w:r>
-          </w:p>
-        </w:tc>
-        <w:tc>
-          <w:tcPr>
-            <w:tcW w:w="4111" w:type="dxa"/>
-            <w:tcBorders>
-              <w:top w:val="single" w:sz="4" w:space="0" w:color="auto"/>
-              <w:left w:val="single" w:sz="4" w:space="0" w:color="auto"/>
-              <w:bottom w:val="single" w:sz="4" w:space="0" w:color="auto"/>
-              <w:right w:val="single" w:sz="4" w:space="0" w:color="auto"/>
-            </w:tcBorders>
-            <w:hideMark/>
-          </w:tcPr>
-          <w:p>
-            <w:pPr>
-              <w:rPr>
-                <w:rFonts w:ascii="Arial" w:hAnsi="Arial" w:cs="Arial"/>
-                <w:sz w:val="20"/>
-                <w:szCs w:val="20"/>
-              </w:rPr>
-            </w:pPr>
-            <w:r>
-              <w:rPr>
-                <w:rFonts w:ascii="Arial" w:hAnsi="Arial" w:cs="Arial"/>
-                <w:sz w:val="20"/>
-                <w:szCs w:val="20"/>
-              </w:rPr>
-              <w:t>${</w:t>
-            </w:r>
-            <w:proofErr w:type="spellStart"/>
-            <w:r>
-              <w:rPr>
-                <w:rFonts w:ascii="Arial" w:hAnsi="Arial" w:cs="Arial"/>
-                <w:sz w:val="20"/>
-                <w:szCs w:val="20"/>
-              </w:rPr>
-              <w:t>pernyataan</w:t>
-            </w:r>
-            <w:r>
-              <w:rPr>
-                <w:rFonts w:ascii="Arial" w:hAnsi="Arial" w:cs="Arial"/>
-                <w:sz w:val="20"/>
-                <w:szCs w:val="20"/>
-              </w:rPr>
-              <w:t>DT</w:t>
-            </w:r>
-            <w:proofErr w:type="spellEnd"/>
-            <w:r>
-              <w:rPr>
-                <w:rFonts w:ascii="Arial" w:hAnsi="Arial" w:cs="Arial"/>
-                <w:sz w:val="20"/>
-                <w:szCs w:val="20"/>
-              </w:rPr>
-              <w:t>}</w:t>
-            </w:r>
-          </w:p>
-        </w:tc>
-        <w:tc>
-          <w:tcPr>
-            <w:tcW w:w="4110" w:type="dxa"/>
-            <w:tcBorders>
-              <w:top w:val="single" w:sz="4" w:space="0" w:color="auto"/>
-              <w:left w:val="single" w:sz="4" w:space="0" w:color="auto"/>
-              <w:bottom w:val="single" w:sz="4" w:space="0" w:color="auto"/>
-              <w:right w:val="single" w:sz="4" w:space="0" w:color="auto"/>
-            </w:tcBorders>
-            <w:hideMark/>
-          </w:tcPr>
-          <w:p>
-            <w:pPr>
-              <w:rPr>
-                <w:rFonts w:ascii="Arial" w:hAnsi="Arial" w:cs="Arial"/>
-                <w:sz w:val="20"/>
-                <w:szCs w:val="20"/>
-              </w:rPr>
-            </w:pPr>
-            <w:r>
-              <w:rPr>
-                <w:rFonts w:ascii="Arial" w:hAnsi="Arial" w:cs="Arial"/>
-                <w:sz w:val="20"/>
-                <w:szCs w:val="20"/>
-              </w:rPr>
-              <w:t>${</w:t>
-            </w:r>
-            <w:proofErr w:type="spellStart"/>
-            <w:r>
-              <w:rPr>
-                <w:rFonts w:ascii="Arial" w:hAnsi="Arial" w:cs="Arial"/>
-                <w:sz w:val="20"/>
-                <w:szCs w:val="20"/>
-              </w:rPr>
-              <w:t>catatan</w:t>
-            </w:r>
-            <w:r>
-              <w:rPr>
-                <w:rFonts w:ascii="Arial" w:hAnsi="Arial" w:cs="Arial"/>
-                <w:sz w:val="20"/>
-                <w:szCs w:val="20"/>
-              </w:rPr>
-              <w:t>DT</w:t>
-            </w:r>
-            <w:proofErr w:type="spellEnd"/>
-            <w:r>
-              <w:rPr>
-                <w:rFonts w:ascii="Arial" w:hAnsi="Arial" w:cs="Arial"/>
-                <w:sz w:val="20"/>
-                <w:szCs w:val="20"/>
-              </w:rPr>
-              <w:t>}</w:t>
-            </w:r>
-          </w:p>
-        </w:tc>
-      </w:tr>
-    </w:tbl>
-    <w:p>
-      <w:pPr>
-        <w:spacing w:after="0" w:line="256" w:lineRule="auto"/>
-        <w:jc w:val="center"/>
-        <w:rPr>
-          <w:rFonts w:ascii="Arial" w:eastAsia="Calibri" w:hAnsi="Arial" w:cs="Arial"/>
-          <w:kern w:val="0"/>
-          <w:sz w:val="20"/>
-          <w:szCs w:val="20"/>
-          <w:lang w:val="en-AU"/>
-          <w14:ligatures w14:val="none"/>
-        </w:rPr>
-      </w:pPr>
-    </w:p>
-    <w:p>
-      <w:pPr>
-        <w:spacing w:after="0" w:line="240" w:lineRule="auto"/>
-        <w:ind w:left="83"/>
-        <w:rPr>
-          <w:rFonts w:ascii="Trebuchet MS" w:hAnsi="Trebuchet MS" w:cs="Arial"/>
-          <w:b/>
-          <w:bCs/>
-        </w:rPr>
-      </w:pPr>
-    </w:p>
-    <w:p>
-      <w:pPr>
-        <w:rPr>
-          <w:rFonts w:ascii="Trebuchet MS" w:hAnsi="Trebuchet MS" w:cs="Arial"/>
-          <w:b/>
-          <w:bCs/>
-          <w:sz w:val="96"/>
-          <w:szCs w:val="96"/>
+          <w:sz w:val="24"/>
+          <w:szCs w:val="24"/>
         </w:rPr>
       </w:pPr>
       <w:r>
@@ -3413,6 +2193,7 @@
                 <w:szCs w:val="20"/>
               </w:rPr>
             </w:pPr>
+            <w:proofErr w:type="gramStart"/>
             <w:r>
               <w:rPr>
                 <w:rFonts w:ascii="Segoe UI Symbol" w:eastAsia="Calibri" w:hAnsi="Segoe UI Symbol" w:cs="Segoe UI Symbol"/>
@@ -3442,6 +2223,7 @@
               <w:t>Observasi</w:t>
             </w:r>
             <w:proofErr w:type="spellEnd"/>
+            <w:proofErr w:type="gramEnd"/>
             <w:r>
               <w:rPr>
                 <w:rFonts w:ascii="Arial" w:eastAsia="Calibri" w:hAnsi="Arial" w:cs="Arial"/>
@@ -6871,39 +5653,12 @@
     </w:tbl>
     <w:p>
       <w:pPr>
-        <w:spacing w:after="0" w:line="240" w:lineRule="auto"/>
-        <w:jc w:val="center"/>
-        <w:rPr>
-          <w:rFonts w:ascii="Arial" w:eastAsia="Calibri" w:hAnsi="Arial" w:cs="Arial"/>
-          <w:b/>
-          <w:noProof/>
-          <w:kern w:val="0"/>
-          <w:sz w:val="20"/>
-          <w:szCs w:val="20"/>
-          <w:lang w:val="en-US"/>
-          <w14:ligatures w14:val="none"/>
-        </w:rPr>
-      </w:pPr>
-    </w:p>
-    <w:p>
-      <w:pPr>
-        <w:spacing w:after="0" w:line="240" w:lineRule="auto"/>
-        <w:ind w:left="83"/>
         <w:rPr>
           <w:rFonts w:ascii="Trebuchet MS" w:hAnsi="Trebuchet MS" w:cs="Arial"/>
           <w:b/>
           <w:bCs/>
-        </w:rPr>
-      </w:pPr>
-    </w:p>
-    <w:p>
-      <w:pPr>
-        <w:rPr>
-          <w:rFonts w:ascii="Trebuchet MS" w:hAnsi="Trebuchet MS" w:cs="Arial"/>
-          <w:b/>
-          <w:bCs/>
-          <w:sz w:val="96"/>
-          <w:szCs w:val="96"/>
+          <w:sz w:val="24"/>
+          <w:szCs w:val="24"/>
         </w:rPr>
       </w:pPr>
       <w:r>
@@ -6911,8 +5666,8 @@
           <w:rFonts w:ascii="Trebuchet MS" w:hAnsi="Trebuchet MS" w:cs="Arial"/>
           <w:b/>
           <w:bCs/>
-          <w:sz w:val="96"/>
-          <w:szCs w:val="96"/>
+          <w:sz w:val="24"/>
+          <w:szCs w:val="24"/>
         </w:rPr>
         <w:br w:type="page"/>
       </w:r>

</xml_diff>